<commit_message>
Fix In-house wait mean, Day D peak concurrency description, and add queue data caveat
</commit_message>
<xml_diff>
--- a/report/final_report_commentary.docx
+++ b/report/final_report_commentary.docx
@@ -552,12 +552,21 @@
     </w:p>
     <w:p>
       <w:r>
-        <w:t>1. Queue Wait Duration: Walk-in guests experience longer queue times (Median 44.5 minutes, Mean 38.4 minutes) compared to In-house hotel guests (Median 28.0 minutes, Mean 30.6 minutes).</w:t>
+        <w:t>1. Queue Wait Duration: Walk-in guests experience longer queue times (Median 44.5 minutes, Mean 38.4 minutes) compared to In-house hotel guests (Median 28.0 minutes, Mean 28.0 minutes).</w:t>
       </w:r>
     </w:p>
     <w:p>
       <w:r>
         <w:t>2. Queue Abandonment (Walk-Away Rate): Contrary to staff perceptions, In-house hotel guests abandon queues at nearly double the rate of Walk-in guests. 7 out of 25 queuing In-house groups walked away (28.0% walk-away rate), whereas only 7 out of 48 queuing Walk-in groups abandoned (14.6% walk-away rate).</w:t>
+      </w:r>
+    </w:p>
+    <w:p>
+      <w:r>
+        <w:rPr>
+          <w:i/>
+          <w:color w:val="4B5563"/>
+        </w:rPr>
+        <w:t>Operational Caveat (Data Limitation): Queue timestamps (queue_start / queue_end) were logged exclusively during Day B and Day C (73 total queuing groups), while Days A, D, and E lacked queue tracking. While this 73-group sample provides statistically sound evidence for auditing Comment 1, mandatory daily queue data logging across all service days is strongly recommended for future operational tracking.</w:t>
       </w:r>
     </w:p>
     <w:p>
@@ -627,7 +636,7 @@
     </w:p>
     <w:p>
       <w:r>
-        <w:t>2. Peak Concurrency Variation: Seated concurrency on Day A peaked at only 16 simultaneous groups, whereas Day C and Day D reached peak stress levels of 20 to 23 simultaneous groups.</w:t>
+        <w:t>2. Peak Concurrency Variation: Seated concurrency on Day A peaked at only 16 simultaneous groups, whereas Day B and Day C reached peak stress levels of 22 to 23 simultaneous tables. Day D and Day E experienced moderate peak concurrency of 18 tables.</w:t>
       </w:r>
     </w:p>
     <w:p>

</xml_diff>